<commit_message>
Add real AWS deployment screenshots to presentation and report
- Captured 9 live screenshots from deployed app at 13.206.252.215:8501
  using Playwright headless browser
- Slide 9 of ClaimIQ_Presentation.pptx: replaced mock screen mockups
  with 5 real app screenshots (home, pipeline, recommendation, history, about)
- Section 11 of ClaimIQ_Project_Report.docx: added real screenshots
  under new subsection 11.1 (Live Application Screenshots - AWS EC2)
- Added scripts: capture_screenshots.py and embed_screenshots.py

Co-Authored-By: Claude Sonnet 4.6 <noreply@anthropic.com>
</commit_message>
<xml_diff>
--- a/ClaimIQ_Project_Report.docx
+++ b/ClaimIQ_Project_Report.docx
@@ -612,6 +612,279 @@
         <w:t>Screenshots of Application / Dashboard / Workflow</w:t>
       </w:r>
     </w:p>
+    <w:p>
+      <w:pPr>
+        <w:pStyle w:val="Heading3"/>
+      </w:pPr>
+      <w:r>
+        <w:t>11.1  Live Application Screenshots (Deployed on AWS EC2 — ap-south-1)</w:t>
+      </w:r>
+    </w:p>
+    <w:p>
+      <w:pPr>
+        <w:jc w:val="center"/>
+      </w:pPr>
+      <w:r>
+        <w:drawing>
+          <wp:inline xmlns:a="http://schemas.openxmlformats.org/drawingml/2006/main" xmlns:pic="http://schemas.openxmlformats.org/drawingml/2006/picture">
+            <wp:extent cx="5303520" cy="3314700"/>
+            <wp:docPr id="1" name="Picture 1"/>
+            <wp:cNvGraphicFramePr>
+              <a:graphicFrameLocks noChangeAspect="1"/>
+            </wp:cNvGraphicFramePr>
+            <a:graphic>
+              <a:graphicData uri="http://schemas.openxmlformats.org/drawingml/2006/picture">
+                <pic:pic>
+                  <pic:nvPicPr>
+                    <pic:cNvPr id="0" name="01_home.png"/>
+                    <pic:cNvPicPr/>
+                  </pic:nvPicPr>
+                  <pic:blipFill>
+                    <a:blip r:embed="rId9"/>
+                    <a:stretch>
+                      <a:fillRect/>
+                    </a:stretch>
+                  </pic:blipFill>
+                  <pic:spPr>
+                    <a:xfrm>
+                      <a:off x="0" y="0"/>
+                      <a:ext cx="5303520" cy="3314700"/>
+                    </a:xfrm>
+                    <a:prstGeom prst="rect"/>
+                  </pic:spPr>
+                </pic:pic>
+              </a:graphicData>
+            </a:graphic>
+          </wp:inline>
+        </w:drawing>
+      </w:r>
+    </w:p>
+    <w:p>
+      <w:pPr>
+        <w:jc w:val="center"/>
+      </w:pPr>
+      <w:r>
+        <w:rPr>
+          <w:b/>
+          <w:color w:val="0A6EBD"/>
+          <w:sz w:val="20"/>
+        </w:rPr>
+        <w:t>1. Home — Upload &amp; System Status</w:t>
+      </w:r>
+    </w:p>
+    <w:p/>
+    <w:p>
+      <w:pPr>
+        <w:jc w:val="center"/>
+      </w:pPr>
+      <w:r>
+        <w:drawing>
+          <wp:inline xmlns:a="http://schemas.openxmlformats.org/drawingml/2006/main" xmlns:pic="http://schemas.openxmlformats.org/drawingml/2006/picture">
+            <wp:extent cx="5303520" cy="3314700"/>
+            <wp:docPr id="2" name="Picture 2"/>
+            <wp:cNvGraphicFramePr>
+              <a:graphicFrameLocks noChangeAspect="1"/>
+            </wp:cNvGraphicFramePr>
+            <a:graphic>
+              <a:graphicData uri="http://schemas.openxmlformats.org/drawingml/2006/picture">
+                <pic:pic>
+                  <pic:nvPicPr>
+                    <pic:cNvPr id="0" name="03_pipeline_complete.png"/>
+                    <pic:cNvPicPr/>
+                  </pic:nvPicPr>
+                  <pic:blipFill>
+                    <a:blip r:embed="rId10"/>
+                    <a:stretch>
+                      <a:fillRect/>
+                    </a:stretch>
+                  </pic:blipFill>
+                  <pic:spPr>
+                    <a:xfrm>
+                      <a:off x="0" y="0"/>
+                      <a:ext cx="5303520" cy="3314700"/>
+                    </a:xfrm>
+                    <a:prstGeom prst="rect"/>
+                  </pic:spPr>
+                </pic:pic>
+              </a:graphicData>
+            </a:graphic>
+          </wp:inline>
+        </w:drawing>
+      </w:r>
+    </w:p>
+    <w:p>
+      <w:pPr>
+        <w:jc w:val="center"/>
+      </w:pPr>
+      <w:r>
+        <w:rPr>
+          <w:b/>
+          <w:color w:val="0A6EBD"/>
+          <w:sz w:val="20"/>
+        </w:rPr>
+        <w:t>2. AI Pipeline — OCR Extraction Results</w:t>
+      </w:r>
+    </w:p>
+    <w:p/>
+    <w:p>
+      <w:pPr>
+        <w:jc w:val="center"/>
+      </w:pPr>
+      <w:r>
+        <w:drawing>
+          <wp:inline xmlns:a="http://schemas.openxmlformats.org/drawingml/2006/main" xmlns:pic="http://schemas.openxmlformats.org/drawingml/2006/picture">
+            <wp:extent cx="5303520" cy="3314700"/>
+            <wp:docPr id="3" name="Picture 3"/>
+            <wp:cNvGraphicFramePr>
+              <a:graphicFrameLocks noChangeAspect="1"/>
+            </wp:cNvGraphicFramePr>
+            <a:graphic>
+              <a:graphicData uri="http://schemas.openxmlformats.org/drawingml/2006/picture">
+                <pic:pic>
+                  <pic:nvPicPr>
+                    <pic:cNvPr id="0" name="03_pipeline_complete.png"/>
+                    <pic:cNvPicPr/>
+                  </pic:nvPicPr>
+                  <pic:blipFill>
+                    <a:blip r:embed="rId10"/>
+                    <a:stretch>
+                      <a:fillRect/>
+                    </a:stretch>
+                  </pic:blipFill>
+                  <pic:spPr>
+                    <a:xfrm>
+                      <a:off x="0" y="0"/>
+                      <a:ext cx="5303520" cy="3314700"/>
+                    </a:xfrm>
+                    <a:prstGeom prst="rect"/>
+                  </pic:spPr>
+                </pic:pic>
+              </a:graphicData>
+            </a:graphic>
+          </wp:inline>
+        </w:drawing>
+      </w:r>
+    </w:p>
+    <w:p>
+      <w:pPr>
+        <w:jc w:val="center"/>
+      </w:pPr>
+      <w:r>
+        <w:rPr>
+          <w:b/>
+          <w:color w:val="0A6EBD"/>
+          <w:sz w:val="20"/>
+        </w:rPr>
+        <w:t>3. AI Recommendation &amp; Policy Citations</w:t>
+      </w:r>
+    </w:p>
+    <w:p/>
+    <w:p>
+      <w:pPr>
+        <w:jc w:val="center"/>
+      </w:pPr>
+      <w:r>
+        <w:drawing>
+          <wp:inline xmlns:a="http://schemas.openxmlformats.org/drawingml/2006/main" xmlns:pic="http://schemas.openxmlformats.org/drawingml/2006/picture">
+            <wp:extent cx="5303520" cy="3314700"/>
+            <wp:docPr id="4" name="Picture 4"/>
+            <wp:cNvGraphicFramePr>
+              <a:graphicFrameLocks noChangeAspect="1"/>
+            </wp:cNvGraphicFramePr>
+            <a:graphic>
+              <a:graphicData uri="http://schemas.openxmlformats.org/drawingml/2006/picture">
+                <pic:pic>
+                  <pic:nvPicPr>
+                    <pic:cNvPr id="0" name="08_claims_history.png"/>
+                    <pic:cNvPicPr/>
+                  </pic:nvPicPr>
+                  <pic:blipFill>
+                    <a:blip r:embed="rId11"/>
+                    <a:stretch>
+                      <a:fillRect/>
+                    </a:stretch>
+                  </pic:blipFill>
+                  <pic:spPr>
+                    <a:xfrm>
+                      <a:off x="0" y="0"/>
+                      <a:ext cx="5303520" cy="3314700"/>
+                    </a:xfrm>
+                    <a:prstGeom prst="rect"/>
+                  </pic:spPr>
+                </pic:pic>
+              </a:graphicData>
+            </a:graphic>
+          </wp:inline>
+        </w:drawing>
+      </w:r>
+    </w:p>
+    <w:p>
+      <w:pPr>
+        <w:jc w:val="center"/>
+      </w:pPr>
+      <w:r>
+        <w:rPr>
+          <w:b/>
+          <w:color w:val="0A6EBD"/>
+          <w:sz w:val="20"/>
+        </w:rPr>
+        <w:t>4. Claims History Dashboard</w:t>
+      </w:r>
+    </w:p>
+    <w:p/>
+    <w:p>
+      <w:pPr>
+        <w:jc w:val="center"/>
+      </w:pPr>
+      <w:r>
+        <w:drawing>
+          <wp:inline xmlns:a="http://schemas.openxmlformats.org/drawingml/2006/main" xmlns:pic="http://schemas.openxmlformats.org/drawingml/2006/picture">
+            <wp:extent cx="5303520" cy="3314700"/>
+            <wp:docPr id="5" name="Picture 5"/>
+            <wp:cNvGraphicFramePr>
+              <a:graphicFrameLocks noChangeAspect="1"/>
+            </wp:cNvGraphicFramePr>
+            <a:graphic>
+              <a:graphicData uri="http://schemas.openxmlformats.org/drawingml/2006/picture">
+                <pic:pic>
+                  <pic:nvPicPr>
+                    <pic:cNvPr id="0" name="09_about.png"/>
+                    <pic:cNvPicPr/>
+                  </pic:nvPicPr>
+                  <pic:blipFill>
+                    <a:blip r:embed="rId12"/>
+                    <a:stretch>
+                      <a:fillRect/>
+                    </a:stretch>
+                  </pic:blipFill>
+                  <pic:spPr>
+                    <a:xfrm>
+                      <a:off x="0" y="0"/>
+                      <a:ext cx="5303520" cy="3314700"/>
+                    </a:xfrm>
+                    <a:prstGeom prst="rect"/>
+                  </pic:spPr>
+                </pic:pic>
+              </a:graphicData>
+            </a:graphic>
+          </wp:inline>
+        </w:drawing>
+      </w:r>
+    </w:p>
+    <w:p>
+      <w:pPr>
+        <w:jc w:val="center"/>
+      </w:pPr>
+      <w:r>
+        <w:rPr>
+          <w:b/>
+          <w:color w:val="0A6EBD"/>
+          <w:sz w:val="20"/>
+        </w:rPr>
+        <w:t>5. About &amp; System Information</w:t>
+      </w:r>
+    </w:p>
+    <w:p/>
     <w:p>
       <w:pPr>
         <w:pStyle w:val="ListNumber"/>

</xml_diff>

<commit_message>
Fix screenshot placement in project report
Screenshots were incorrectly inserted after the TOC list entry instead
of under Section 11. Moved 16 elements (heading + 5 images with
captions) to their correct position immediately after the Section 11
heading.

Co-Authored-By: Claude Sonnet 4.6 <noreply@anthropic.com>
</commit_message>
<xml_diff>
--- a/ClaimIQ_Project_Report.docx
+++ b/ClaimIQ_Project_Report.docx
@@ -612,279 +612,6 @@
         <w:t>Screenshots of Application / Dashboard / Workflow</w:t>
       </w:r>
     </w:p>
-    <w:p>
-      <w:pPr>
-        <w:pStyle w:val="Heading3"/>
-      </w:pPr>
-      <w:r>
-        <w:t>11.1  Live Application Screenshots (Deployed on AWS EC2 — ap-south-1)</w:t>
-      </w:r>
-    </w:p>
-    <w:p>
-      <w:pPr>
-        <w:jc w:val="center"/>
-      </w:pPr>
-      <w:r>
-        <w:drawing>
-          <wp:inline xmlns:a="http://schemas.openxmlformats.org/drawingml/2006/main" xmlns:pic="http://schemas.openxmlformats.org/drawingml/2006/picture">
-            <wp:extent cx="5303520" cy="3314700"/>
-            <wp:docPr id="1" name="Picture 1"/>
-            <wp:cNvGraphicFramePr>
-              <a:graphicFrameLocks noChangeAspect="1"/>
-            </wp:cNvGraphicFramePr>
-            <a:graphic>
-              <a:graphicData uri="http://schemas.openxmlformats.org/drawingml/2006/picture">
-                <pic:pic>
-                  <pic:nvPicPr>
-                    <pic:cNvPr id="0" name="01_home.png"/>
-                    <pic:cNvPicPr/>
-                  </pic:nvPicPr>
-                  <pic:blipFill>
-                    <a:blip r:embed="rId9"/>
-                    <a:stretch>
-                      <a:fillRect/>
-                    </a:stretch>
-                  </pic:blipFill>
-                  <pic:spPr>
-                    <a:xfrm>
-                      <a:off x="0" y="0"/>
-                      <a:ext cx="5303520" cy="3314700"/>
-                    </a:xfrm>
-                    <a:prstGeom prst="rect"/>
-                  </pic:spPr>
-                </pic:pic>
-              </a:graphicData>
-            </a:graphic>
-          </wp:inline>
-        </w:drawing>
-      </w:r>
-    </w:p>
-    <w:p>
-      <w:pPr>
-        <w:jc w:val="center"/>
-      </w:pPr>
-      <w:r>
-        <w:rPr>
-          <w:b/>
-          <w:color w:val="0A6EBD"/>
-          <w:sz w:val="20"/>
-        </w:rPr>
-        <w:t>1. Home — Upload &amp; System Status</w:t>
-      </w:r>
-    </w:p>
-    <w:p/>
-    <w:p>
-      <w:pPr>
-        <w:jc w:val="center"/>
-      </w:pPr>
-      <w:r>
-        <w:drawing>
-          <wp:inline xmlns:a="http://schemas.openxmlformats.org/drawingml/2006/main" xmlns:pic="http://schemas.openxmlformats.org/drawingml/2006/picture">
-            <wp:extent cx="5303520" cy="3314700"/>
-            <wp:docPr id="2" name="Picture 2"/>
-            <wp:cNvGraphicFramePr>
-              <a:graphicFrameLocks noChangeAspect="1"/>
-            </wp:cNvGraphicFramePr>
-            <a:graphic>
-              <a:graphicData uri="http://schemas.openxmlformats.org/drawingml/2006/picture">
-                <pic:pic>
-                  <pic:nvPicPr>
-                    <pic:cNvPr id="0" name="03_pipeline_complete.png"/>
-                    <pic:cNvPicPr/>
-                  </pic:nvPicPr>
-                  <pic:blipFill>
-                    <a:blip r:embed="rId10"/>
-                    <a:stretch>
-                      <a:fillRect/>
-                    </a:stretch>
-                  </pic:blipFill>
-                  <pic:spPr>
-                    <a:xfrm>
-                      <a:off x="0" y="0"/>
-                      <a:ext cx="5303520" cy="3314700"/>
-                    </a:xfrm>
-                    <a:prstGeom prst="rect"/>
-                  </pic:spPr>
-                </pic:pic>
-              </a:graphicData>
-            </a:graphic>
-          </wp:inline>
-        </w:drawing>
-      </w:r>
-    </w:p>
-    <w:p>
-      <w:pPr>
-        <w:jc w:val="center"/>
-      </w:pPr>
-      <w:r>
-        <w:rPr>
-          <w:b/>
-          <w:color w:val="0A6EBD"/>
-          <w:sz w:val="20"/>
-        </w:rPr>
-        <w:t>2. AI Pipeline — OCR Extraction Results</w:t>
-      </w:r>
-    </w:p>
-    <w:p/>
-    <w:p>
-      <w:pPr>
-        <w:jc w:val="center"/>
-      </w:pPr>
-      <w:r>
-        <w:drawing>
-          <wp:inline xmlns:a="http://schemas.openxmlformats.org/drawingml/2006/main" xmlns:pic="http://schemas.openxmlformats.org/drawingml/2006/picture">
-            <wp:extent cx="5303520" cy="3314700"/>
-            <wp:docPr id="3" name="Picture 3"/>
-            <wp:cNvGraphicFramePr>
-              <a:graphicFrameLocks noChangeAspect="1"/>
-            </wp:cNvGraphicFramePr>
-            <a:graphic>
-              <a:graphicData uri="http://schemas.openxmlformats.org/drawingml/2006/picture">
-                <pic:pic>
-                  <pic:nvPicPr>
-                    <pic:cNvPr id="0" name="03_pipeline_complete.png"/>
-                    <pic:cNvPicPr/>
-                  </pic:nvPicPr>
-                  <pic:blipFill>
-                    <a:blip r:embed="rId10"/>
-                    <a:stretch>
-                      <a:fillRect/>
-                    </a:stretch>
-                  </pic:blipFill>
-                  <pic:spPr>
-                    <a:xfrm>
-                      <a:off x="0" y="0"/>
-                      <a:ext cx="5303520" cy="3314700"/>
-                    </a:xfrm>
-                    <a:prstGeom prst="rect"/>
-                  </pic:spPr>
-                </pic:pic>
-              </a:graphicData>
-            </a:graphic>
-          </wp:inline>
-        </w:drawing>
-      </w:r>
-    </w:p>
-    <w:p>
-      <w:pPr>
-        <w:jc w:val="center"/>
-      </w:pPr>
-      <w:r>
-        <w:rPr>
-          <w:b/>
-          <w:color w:val="0A6EBD"/>
-          <w:sz w:val="20"/>
-        </w:rPr>
-        <w:t>3. AI Recommendation &amp; Policy Citations</w:t>
-      </w:r>
-    </w:p>
-    <w:p/>
-    <w:p>
-      <w:pPr>
-        <w:jc w:val="center"/>
-      </w:pPr>
-      <w:r>
-        <w:drawing>
-          <wp:inline xmlns:a="http://schemas.openxmlformats.org/drawingml/2006/main" xmlns:pic="http://schemas.openxmlformats.org/drawingml/2006/picture">
-            <wp:extent cx="5303520" cy="3314700"/>
-            <wp:docPr id="4" name="Picture 4"/>
-            <wp:cNvGraphicFramePr>
-              <a:graphicFrameLocks noChangeAspect="1"/>
-            </wp:cNvGraphicFramePr>
-            <a:graphic>
-              <a:graphicData uri="http://schemas.openxmlformats.org/drawingml/2006/picture">
-                <pic:pic>
-                  <pic:nvPicPr>
-                    <pic:cNvPr id="0" name="08_claims_history.png"/>
-                    <pic:cNvPicPr/>
-                  </pic:nvPicPr>
-                  <pic:blipFill>
-                    <a:blip r:embed="rId11"/>
-                    <a:stretch>
-                      <a:fillRect/>
-                    </a:stretch>
-                  </pic:blipFill>
-                  <pic:spPr>
-                    <a:xfrm>
-                      <a:off x="0" y="0"/>
-                      <a:ext cx="5303520" cy="3314700"/>
-                    </a:xfrm>
-                    <a:prstGeom prst="rect"/>
-                  </pic:spPr>
-                </pic:pic>
-              </a:graphicData>
-            </a:graphic>
-          </wp:inline>
-        </w:drawing>
-      </w:r>
-    </w:p>
-    <w:p>
-      <w:pPr>
-        <w:jc w:val="center"/>
-      </w:pPr>
-      <w:r>
-        <w:rPr>
-          <w:b/>
-          <w:color w:val="0A6EBD"/>
-          <w:sz w:val="20"/>
-        </w:rPr>
-        <w:t>4. Claims History Dashboard</w:t>
-      </w:r>
-    </w:p>
-    <w:p/>
-    <w:p>
-      <w:pPr>
-        <w:jc w:val="center"/>
-      </w:pPr>
-      <w:r>
-        <w:drawing>
-          <wp:inline xmlns:a="http://schemas.openxmlformats.org/drawingml/2006/main" xmlns:pic="http://schemas.openxmlformats.org/drawingml/2006/picture">
-            <wp:extent cx="5303520" cy="3314700"/>
-            <wp:docPr id="5" name="Picture 5"/>
-            <wp:cNvGraphicFramePr>
-              <a:graphicFrameLocks noChangeAspect="1"/>
-            </wp:cNvGraphicFramePr>
-            <a:graphic>
-              <a:graphicData uri="http://schemas.openxmlformats.org/drawingml/2006/picture">
-                <pic:pic>
-                  <pic:nvPicPr>
-                    <pic:cNvPr id="0" name="09_about.png"/>
-                    <pic:cNvPicPr/>
-                  </pic:nvPicPr>
-                  <pic:blipFill>
-                    <a:blip r:embed="rId12"/>
-                    <a:stretch>
-                      <a:fillRect/>
-                    </a:stretch>
-                  </pic:blipFill>
-                  <pic:spPr>
-                    <a:xfrm>
-                      <a:off x="0" y="0"/>
-                      <a:ext cx="5303520" cy="3314700"/>
-                    </a:xfrm>
-                    <a:prstGeom prst="rect"/>
-                  </pic:spPr>
-                </pic:pic>
-              </a:graphicData>
-            </a:graphic>
-          </wp:inline>
-        </w:drawing>
-      </w:r>
-    </w:p>
-    <w:p>
-      <w:pPr>
-        <w:jc w:val="center"/>
-      </w:pPr>
-      <w:r>
-        <w:rPr>
-          <w:b/>
-          <w:color w:val="0A6EBD"/>
-          <w:sz w:val="20"/>
-        </w:rPr>
-        <w:t>5. About &amp; System Information</w:t>
-      </w:r>
-    </w:p>
-    <w:p/>
     <w:p>
       <w:pPr>
         <w:pStyle w:val="ListNumber"/>
@@ -8419,6 +8146,279 @@
         <w:t>11. Screenshots of Application / Dashboard / Workflow</w:t>
       </w:r>
     </w:p>
+    <w:p>
+      <w:pPr>
+        <w:pStyle w:val="Heading3"/>
+      </w:pPr>
+      <w:r>
+        <w:t>11.1  Live Application Screenshots (Deployed on AWS EC2 — ap-south-1)</w:t>
+      </w:r>
+    </w:p>
+    <w:p>
+      <w:pPr>
+        <w:jc w:val="center"/>
+      </w:pPr>
+      <w:r>
+        <w:drawing>
+          <wp:inline xmlns:a="http://schemas.openxmlformats.org/drawingml/2006/main" xmlns:pic="http://schemas.openxmlformats.org/drawingml/2006/picture">
+            <wp:extent cx="5303520" cy="3314700"/>
+            <wp:docPr id="1" name="Picture 1"/>
+            <wp:cNvGraphicFramePr>
+              <a:graphicFrameLocks noChangeAspect="1"/>
+            </wp:cNvGraphicFramePr>
+            <a:graphic>
+              <a:graphicData uri="http://schemas.openxmlformats.org/drawingml/2006/picture">
+                <pic:pic>
+                  <pic:nvPicPr>
+                    <pic:cNvPr id="0" name="01_home.png"/>
+                    <pic:cNvPicPr/>
+                  </pic:nvPicPr>
+                  <pic:blipFill>
+                    <a:blip r:embed="rId9"/>
+                    <a:stretch>
+                      <a:fillRect/>
+                    </a:stretch>
+                  </pic:blipFill>
+                  <pic:spPr>
+                    <a:xfrm>
+                      <a:off x="0" y="0"/>
+                      <a:ext cx="5303520" cy="3314700"/>
+                    </a:xfrm>
+                    <a:prstGeom prst="rect"/>
+                  </pic:spPr>
+                </pic:pic>
+              </a:graphicData>
+            </a:graphic>
+          </wp:inline>
+        </w:drawing>
+      </w:r>
+    </w:p>
+    <w:p>
+      <w:pPr>
+        <w:jc w:val="center"/>
+      </w:pPr>
+      <w:r>
+        <w:rPr>
+          <w:b/>
+          <w:color w:val="0A6EBD"/>
+          <w:sz w:val="20"/>
+        </w:rPr>
+        <w:t>1. Home — Upload &amp; System Status</w:t>
+      </w:r>
+    </w:p>
+    <w:p/>
+    <w:p>
+      <w:pPr>
+        <w:jc w:val="center"/>
+      </w:pPr>
+      <w:r>
+        <w:drawing>
+          <wp:inline xmlns:a="http://schemas.openxmlformats.org/drawingml/2006/main" xmlns:pic="http://schemas.openxmlformats.org/drawingml/2006/picture">
+            <wp:extent cx="5303520" cy="3314700"/>
+            <wp:docPr id="2" name="Picture 2"/>
+            <wp:cNvGraphicFramePr>
+              <a:graphicFrameLocks noChangeAspect="1"/>
+            </wp:cNvGraphicFramePr>
+            <a:graphic>
+              <a:graphicData uri="http://schemas.openxmlformats.org/drawingml/2006/picture">
+                <pic:pic>
+                  <pic:nvPicPr>
+                    <pic:cNvPr id="0" name="03_pipeline_complete.png"/>
+                    <pic:cNvPicPr/>
+                  </pic:nvPicPr>
+                  <pic:blipFill>
+                    <a:blip r:embed="rId10"/>
+                    <a:stretch>
+                      <a:fillRect/>
+                    </a:stretch>
+                  </pic:blipFill>
+                  <pic:spPr>
+                    <a:xfrm>
+                      <a:off x="0" y="0"/>
+                      <a:ext cx="5303520" cy="3314700"/>
+                    </a:xfrm>
+                    <a:prstGeom prst="rect"/>
+                  </pic:spPr>
+                </pic:pic>
+              </a:graphicData>
+            </a:graphic>
+          </wp:inline>
+        </w:drawing>
+      </w:r>
+    </w:p>
+    <w:p>
+      <w:pPr>
+        <w:jc w:val="center"/>
+      </w:pPr>
+      <w:r>
+        <w:rPr>
+          <w:b/>
+          <w:color w:val="0A6EBD"/>
+          <w:sz w:val="20"/>
+        </w:rPr>
+        <w:t>2. AI Pipeline — OCR Extraction Results</w:t>
+      </w:r>
+    </w:p>
+    <w:p/>
+    <w:p>
+      <w:pPr>
+        <w:jc w:val="center"/>
+      </w:pPr>
+      <w:r>
+        <w:drawing>
+          <wp:inline xmlns:a="http://schemas.openxmlformats.org/drawingml/2006/main" xmlns:pic="http://schemas.openxmlformats.org/drawingml/2006/picture">
+            <wp:extent cx="5303520" cy="3314700"/>
+            <wp:docPr id="3" name="Picture 3"/>
+            <wp:cNvGraphicFramePr>
+              <a:graphicFrameLocks noChangeAspect="1"/>
+            </wp:cNvGraphicFramePr>
+            <a:graphic>
+              <a:graphicData uri="http://schemas.openxmlformats.org/drawingml/2006/picture">
+                <pic:pic>
+                  <pic:nvPicPr>
+                    <pic:cNvPr id="0" name="03_pipeline_complete.png"/>
+                    <pic:cNvPicPr/>
+                  </pic:nvPicPr>
+                  <pic:blipFill>
+                    <a:blip r:embed="rId10"/>
+                    <a:stretch>
+                      <a:fillRect/>
+                    </a:stretch>
+                  </pic:blipFill>
+                  <pic:spPr>
+                    <a:xfrm>
+                      <a:off x="0" y="0"/>
+                      <a:ext cx="5303520" cy="3314700"/>
+                    </a:xfrm>
+                    <a:prstGeom prst="rect"/>
+                  </pic:spPr>
+                </pic:pic>
+              </a:graphicData>
+            </a:graphic>
+          </wp:inline>
+        </w:drawing>
+      </w:r>
+    </w:p>
+    <w:p>
+      <w:pPr>
+        <w:jc w:val="center"/>
+      </w:pPr>
+      <w:r>
+        <w:rPr>
+          <w:b/>
+          <w:color w:val="0A6EBD"/>
+          <w:sz w:val="20"/>
+        </w:rPr>
+        <w:t>3. AI Recommendation &amp; Policy Citations</w:t>
+      </w:r>
+    </w:p>
+    <w:p/>
+    <w:p>
+      <w:pPr>
+        <w:jc w:val="center"/>
+      </w:pPr>
+      <w:r>
+        <w:drawing>
+          <wp:inline xmlns:a="http://schemas.openxmlformats.org/drawingml/2006/main" xmlns:pic="http://schemas.openxmlformats.org/drawingml/2006/picture">
+            <wp:extent cx="5303520" cy="3314700"/>
+            <wp:docPr id="4" name="Picture 4"/>
+            <wp:cNvGraphicFramePr>
+              <a:graphicFrameLocks noChangeAspect="1"/>
+            </wp:cNvGraphicFramePr>
+            <a:graphic>
+              <a:graphicData uri="http://schemas.openxmlformats.org/drawingml/2006/picture">
+                <pic:pic>
+                  <pic:nvPicPr>
+                    <pic:cNvPr id="0" name="08_claims_history.png"/>
+                    <pic:cNvPicPr/>
+                  </pic:nvPicPr>
+                  <pic:blipFill>
+                    <a:blip r:embed="rId11"/>
+                    <a:stretch>
+                      <a:fillRect/>
+                    </a:stretch>
+                  </pic:blipFill>
+                  <pic:spPr>
+                    <a:xfrm>
+                      <a:off x="0" y="0"/>
+                      <a:ext cx="5303520" cy="3314700"/>
+                    </a:xfrm>
+                    <a:prstGeom prst="rect"/>
+                  </pic:spPr>
+                </pic:pic>
+              </a:graphicData>
+            </a:graphic>
+          </wp:inline>
+        </w:drawing>
+      </w:r>
+    </w:p>
+    <w:p>
+      <w:pPr>
+        <w:jc w:val="center"/>
+      </w:pPr>
+      <w:r>
+        <w:rPr>
+          <w:b/>
+          <w:color w:val="0A6EBD"/>
+          <w:sz w:val="20"/>
+        </w:rPr>
+        <w:t>4. Claims History Dashboard</w:t>
+      </w:r>
+    </w:p>
+    <w:p/>
+    <w:p>
+      <w:pPr>
+        <w:jc w:val="center"/>
+      </w:pPr>
+      <w:r>
+        <w:drawing>
+          <wp:inline xmlns:a="http://schemas.openxmlformats.org/drawingml/2006/main" xmlns:pic="http://schemas.openxmlformats.org/drawingml/2006/picture">
+            <wp:extent cx="5303520" cy="3314700"/>
+            <wp:docPr id="5" name="Picture 5"/>
+            <wp:cNvGraphicFramePr>
+              <a:graphicFrameLocks noChangeAspect="1"/>
+            </wp:cNvGraphicFramePr>
+            <a:graphic>
+              <a:graphicData uri="http://schemas.openxmlformats.org/drawingml/2006/picture">
+                <pic:pic>
+                  <pic:nvPicPr>
+                    <pic:cNvPr id="0" name="09_about.png"/>
+                    <pic:cNvPicPr/>
+                  </pic:nvPicPr>
+                  <pic:blipFill>
+                    <a:blip r:embed="rId12"/>
+                    <a:stretch>
+                      <a:fillRect/>
+                    </a:stretch>
+                  </pic:blipFill>
+                  <pic:spPr>
+                    <a:xfrm>
+                      <a:off x="0" y="0"/>
+                      <a:ext cx="5303520" cy="3314700"/>
+                    </a:xfrm>
+                    <a:prstGeom prst="rect"/>
+                  </pic:spPr>
+                </pic:pic>
+              </a:graphicData>
+            </a:graphic>
+          </wp:inline>
+        </w:drawing>
+      </w:r>
+    </w:p>
+    <w:p>
+      <w:pPr>
+        <w:jc w:val="center"/>
+      </w:pPr>
+      <w:r>
+        <w:rPr>
+          <w:b/>
+          <w:color w:val="0A6EBD"/>
+          <w:sz w:val="20"/>
+        </w:rPr>
+        <w:t>5. About &amp; System Information</w:t>
+      </w:r>
+    </w:p>
+    <w:p/>
     <w:p>
       <w:pPr>
         <w:spacing w:after="80"/>

</xml_diff>